<commit_message>
Incorporar corpus starter (324 utterances, 54 intenciones), domain/rules, experimentos y documentos
- corpus_metadata.csv / dataset_split.csv / corpus_summary.json y encuestas simuladas P01 (n=120)
- domain.yml, data/nlu.yml, nlu_full.yml, rules.yml
- experiments/: baseline P07 y simulaciones P14, con rutas relativas al repositorio
  (re-ejecutados en Windows: reproducen exactamente los resultados originales)
- docs/: protocolo actualizado, Ficha de Diagnóstico P01 (OE1), Informe de Ejecución Preliminar
- incident_log.csv con 4 incidencias (P16)
- logs/: auditoría y baseline (5 semillas) sobre el corpus starter
- run_rasa_grid.py: opción --only-repetitions para reanudar la Fase 2
- README fusionado; openpyxl agregado a requirements.txt

Co-Authored-By: Claude Opus 5.5 <noreply@anthropic.com>
</commit_message>
<xml_diff>
--- a/docs/Planteamiento_Metodologia_Protocolo_Matriz_ChatbotMPSR.docx
+++ b/docs/Planteamiento_Metodologia_Protocolo_Matriz_ChatbotMPSR.docx
@@ -315,7 +315,7 @@
           <w:sz w:val="24"/>
           <w:szCs w:val="24"/>
         </w:rPr>
-        <w:t xml:space="preserve">El nivel es explicativo: se busca establecer la relación causal entre la variable independiente (Chatbot con IA — Rasa NLU/DIET classifier, OE2) y la variable dependiente (Atención al ciudadano en la MPSR, medida a través de OE1, OE3 y OE4). El diseño es pre-experimental, de un solo grupo con medición antes y después (pre-test / post-test), de temporalidad transversal, siguiendo un método hipotético-deductivo. El pre-test corresponde al diagnóstico de OE1 (línea base de tiempos y limitaciones de la atención presencial/TramiFácil) y el post-test a la medición de OE3 y OE4 tras el despliegue del chatbot.</w:t>
+        <w:t xml:space="preserve">El nivel es explicativo: se busca establecer la relación causal entre la variable independiente (Chatbot con IA — Rasa NLU/DIET classifier, OE2) y la variable dependiente (Atención al ciudadano en la MPSR, medida a través de OE1, OE3 y OE4). El diseño es pre-experimental, de un solo grupo con medición antes y después (pre-test/post-test), de temporalidad transversal, siguiendo un método hipotético-deductivo — consistente con la clasificación metodológica definida en el Cap. III de Tesis I. El pre-test corresponde al diagnóstico de OE1 (línea base de tiempos, limitaciones y satisfacción con la atención presencial/TramiFácil) y el post-test a la medición de OE3 y OE4 tras el despliegue del chatbot, aplicados sobre los mismos sujetos (ver Sección 2.4 sobre el tamaño de muestra y el mecanismo de recontacto).</w:t>
       </w:r>
     </w:p>
     <w:p>
@@ -463,7 +463,7 @@
           <w:sz w:val="24"/>
           <w:szCs w:val="24"/>
         </w:rPr>
-        <w:t xml:space="preserve">Diagnóstico OE1 (línea base de tiempos). Muestreo probabilístico estratificado, usando como estratos las 9 categorías de trámite del Corpus MPSR-Bot, con afijación proporcional al volumen mensual de cada categoría registrado por la Plataforma de Atención. Instrumento: ficha de observación/registro de tiempos (hora de inicio y hora de atención finalizada) aplicada por el personal de la Plataforma durante dos semanas consecutivas. Tamaño de muestra: se calculará con la fórmula para poblaciones finitas n = (N·Z²·p·q) / (e²·(N−1) + Z²·p·q), con Z = 1.96 (confianza 95 %), p = q = 0.5 (máxima variabilidad) y e = 5 %, usando como N el promedio mensual de atenciones que reporte la MPSR; como referencia preliminar (N ≈ 400 atenciones/mes, e = 7.5 %) el cálculo arroja n ≈ 120, cifra que se confirmará con el dato oficial antes de iniciar el registro. Se fija un mínimo de 10 observaciones por categoría para asegurar representatividad de las 9 categorías.</w:t>
+        <w:t xml:space="preserve">Punto de reclutamiento. La MPSR no otorgó autorización para desplegar el chatbot en su plataforma ni para realizar trabajo de campo dentro de su local (ni observación, ni un cartel/QR informativo). Por ello, el reclutamiento se realiza en estudios contables y oficinas de abogados de Juliaca, cuyos clientes acuden frecuentemente a resolver trámites ante la MPSR (licencias, tributos, documentación legal). Esto implica un muestreo no probabilístico por cuotas (no estratificado aleatorio puro): se recolecta hasta cubrir un mínimo de 3 observaciones por cada una de las 9 categorías, pero el punto de reclutamiento favorece ciertos trámites (licencias, tributos, documentación legal) y probablemente subrepresenta otros (reclamos, registro civil, servicios públicos). Esta limitación se declara explícitamente en la discusión de resultados.</w:t>
       </w:r>
     </w:p>
     <w:p>
@@ -479,7 +479,23 @@
           <w:sz w:val="24"/>
           <w:szCs w:val="24"/>
         </w:rPr>
-        <w:t xml:space="preserve">Encuesta de satisfacción OE4 (n = 120). Muestreo probabilístico aleatorio simple entre los ciudadanos que completen al menos una interacción con el chatbot durante el periodo piloto. Criterio de inclusión: haber recibido una respuesta del chatbot a su consulta. Criterio de exclusión: conversaciones abandonadas antes de obtener respuesta. Justificación del tamaño: aplicando la misma fórmula de poblaciones finitas con N ≈ 400 (estimado de atenciones mensuales), Z = 1.96, p = q = 0.5 y e = 7.5 %, se obtiene n ≈ 120, valor que además coincide con el antecedente nacional de Vargas Ríos (2022) en un contexto municipal similar.</w:t>
+        <w:t xml:space="preserve">Un solo grupo, medido dos veces (pre-test/post-test). Se trabaja con un único grupo de ciudadanos reclutados en los puntos anteriores, medidos primero con la Ficha de Diagnóstico P01 (línea base: tiempo aproximado por rangos, limitaciones percibidas y satisfacción actual con la atención presencial/TramiFácil) y, tras usar el chatbot durante el piloto, vueltos a medir con el mismo instrumento adaptado (tiempo de respuesta del chatbot y encuesta de satisfacción, OE3–OE4). Al momento de aplicar la Ficha P01 se solicita un número de WhatsApp únicamente para fines de seguimiento del estudio, el cual se elimina al concluir el análisis.</w:t>
+      </w:r>
+    </w:p>
+    <w:p>
+      <w:pPr>
+        <w:spacing w:after="0" w:line="480" w:lineRule="auto"/>
+        <w:ind w:firstLine="720"/>
+        <w:jc w:val="left"/>
+      </w:pPr>
+      <w:r>
+        <w:rPr>
+          <w:rFonts w:ascii="Times New Roman" w:cs="Times New Roman" w:eastAsia="Times New Roman" w:hAnsi="Times New Roman"/>
+          <w:color w:val="000000"/>
+          <w:sz w:val="24"/>
+          <w:szCs w:val="24"/>
+        </w:rPr>
+        <w:t xml:space="preserve">Tamaño de muestra: n = 120. Se calcula con la fórmula para poblaciones finitas n = (N·Z²·p·q) / (e²·(N−1) + Z²·p·q), con Z = 1.96 (confianza 95 %), p = q = 0.5 (máxima variabilidad) y e = 5 %, usando como N el promedio mensual de atenciones que reporte la MPSR; como referencia preliminar (N ≈ 400 atenciones/mes, e = 7.5 %) el cálculo arroja n ≈ 120, valor que además coincide con el antecedente nacional de Vargas Ríos (2022) en un contexto municipal similar. Se fija un mínimo de 3 observaciones por categoría para asegurar representatividad de las 9 categorías (ajustable si la distribución real del reclutamiento lo permite).</w:t>
       </w:r>
     </w:p>
     <w:p>
@@ -967,7 +983,7 @@
           <w:sz w:val="24"/>
           <w:szCs w:val="24"/>
         </w:rPr>
-        <w:t xml:space="preserve">Para todo N razonable entre 250 y 600 atenciones mensuales, n se mantiene entre 100 y 135. Por ello se fija n = 120 como valor de trabajo para el diagnóstico (OE1, línea base) y para la encuesta de satisfacción (OE4), y se recalculará con el registro oficial de la Plataforma antes de iniciar P01; de diferir sustancialmente del rango evaluado, se documentará como incidencia (P16) y se actualizará la muestra.</w:t>
+        <w:t xml:space="preserve">Para todo N razonable entre 250 y 600 atenciones mensuales, n se mantiene entre 100 y 135. Por ello se fija n = 120 como valor de trabajo para el único grupo (recontactado antes y después del piloto), y se recalculará con el registro oficial de la Plataforma antes de iniciar P01; de diferir sustancialmente del rango evaluado, se documentará como incidencia (P16) y se actualizará la muestra.</w:t>
       </w:r>
     </w:p>
     <w:p>
@@ -1189,7 +1205,7 @@
           <w:sz w:val="24"/>
           <w:szCs w:val="24"/>
         </w:rPr>
-        <w:t xml:space="preserve">2.11 Evaluación del efecto en la atención ciudadana (OE1 → OE3 → OE4)</w:t>
+        <w:t xml:space="preserve">2.11 Pruebas técnicas internas (control de calidad del sistema)</w:t>
       </w:r>
     </w:p>
     <w:p>
@@ -1205,7 +1221,235 @@
           <w:sz w:val="24"/>
           <w:szCs w:val="24"/>
         </w:rPr>
-        <w:t xml:space="preserve">Todos los métodos de clasificación se evalúan bajo las mismas condiciones (mismas particiones y semillas) para fijar la arquitectura de OE2. El efecto del chatbot sobre la atención ciudadana se evalúa mediante un diseño pre-test/post-test de un solo grupo: el pre-test es el diagnóstico de OE1 (tiempos y limitaciones de la atención presencial/TramiFácil) y el post-test es la medición de OE3 (tiempo de respuesta con el chatbot) y OE4 (satisfacción ciudadana). Antes de aplicar la prueba de hipótesis se verificará el supuesto de normalidad de las diferencias pre/post con la prueba de Shapiro-Wilk (α = 0.05): si se cumple la normalidad, se aplica la prueba t de Student para muestras pareadas; si no se cumple, se aplica su alternativa no paramétrica, la prueba de Wilcoxon (rangos con signo), manteniendo el mismo nivel de significancia α = 0.05.</w:t>
+        <w:t xml:space="preserve">Antes de que cualquier persona ajena al desarrollo interactúe con el chatbot (incluido el pre-piloto de la Sección 2.12), se ejecuta una batería de pruebas puramente técnicas, realizadas por el propio tesista, sobre el sistema integrado (NLU + gestión del diálogo construida en OE2).</w:t>
+      </w:r>
+    </w:p>
+    <w:p>
+      <w:pPr>
+        <w:spacing w:after="0" w:line="480" w:lineRule="auto"/>
+        <w:ind w:left="720" w:hanging="360"/>
+        <w:jc w:val="left"/>
+      </w:pPr>
+      <w:r>
+        <w:rPr>
+          <w:rFonts w:ascii="Times New Roman" w:cs="Times New Roman" w:eastAsia="Times New Roman" w:hAnsi="Times New Roman"/>
+          <w:color w:val="000000"/>
+          <w:sz w:val="24"/>
+          <w:szCs w:val="24"/>
+        </w:rPr>
+        <w:t xml:space="preserve">• Validación de datos: 'rasa data validate' para detectar conflictos o contradicciones entre stories y rules antes de entrenar el modelo de diálogo.</w:t>
+      </w:r>
+    </w:p>
+    <w:p>
+      <w:pPr>
+        <w:spacing w:after="0" w:line="480" w:lineRule="auto"/>
+        <w:ind w:left="720" w:hanging="360"/>
+        <w:jc w:val="left"/>
+      </w:pPr>
+      <w:r>
+        <w:rPr>
+          <w:rFonts w:ascii="Times New Roman" w:cs="Times New Roman" w:eastAsia="Times New Roman" w:hAnsi="Times New Roman"/>
+          <w:color w:val="000000"/>
+          <w:sz w:val="24"/>
+          <w:szCs w:val="24"/>
+        </w:rPr>
+        <w:t xml:space="preserve">• Validación cruzada del NLU: 'rasa test nlu --cross-validation' sobre el Corpus MPSR-Bot, como verificación preliminar de desempeño antes de cualquier despliegue.</w:t>
+      </w:r>
+    </w:p>
+    <w:p>
+      <w:pPr>
+        <w:spacing w:after="0" w:line="480" w:lineRule="auto"/>
+        <w:ind w:left="720" w:hanging="360"/>
+        <w:jc w:val="left"/>
+      </w:pPr>
+      <w:r>
+        <w:rPr>
+          <w:rFonts w:ascii="Times New Roman" w:cs="Times New Roman" w:eastAsia="Times New Roman" w:hAnsi="Times New Roman"/>
+          <w:color w:val="000000"/>
+          <w:sz w:val="24"/>
+          <w:szCs w:val="24"/>
+        </w:rPr>
+        <w:t xml:space="preserve">• Pruebas del modelo de diálogo: 'rasa test core' sobre el conjunto de stories, para confirmar que el sistema predice la acción correcta ante cada secuencia de conversación.</w:t>
+      </w:r>
+    </w:p>
+    <w:p>
+      <w:pPr>
+        <w:spacing w:after="0" w:line="480" w:lineRule="auto"/>
+        <w:ind w:left="720" w:hanging="360"/>
+        <w:jc w:val="left"/>
+      </w:pPr>
+      <w:r>
+        <w:rPr>
+          <w:rFonts w:ascii="Times New Roman" w:cs="Times New Roman" w:eastAsia="Times New Roman" w:hAnsi="Times New Roman"/>
+          <w:color w:val="000000"/>
+          <w:sz w:val="24"/>
+          <w:szCs w:val="24"/>
+        </w:rPr>
+        <w:t xml:space="preserve">• Pruebas unitarias de custom actions (pytest): cada acción personalizada se prueba con entradas controladas y su salida esperada.</w:t>
+      </w:r>
+    </w:p>
+    <w:p>
+      <w:pPr>
+        <w:spacing w:after="0" w:line="480" w:lineRule="auto"/>
+        <w:ind w:left="720" w:hanging="360"/>
+        <w:jc w:val="left"/>
+      </w:pPr>
+      <w:r>
+        <w:rPr>
+          <w:rFonts w:ascii="Times New Roman" w:cs="Times New Roman" w:eastAsia="Times New Roman" w:hAnsi="Times New Roman"/>
+          <w:color w:val="000000"/>
+          <w:sz w:val="24"/>
+          <w:szCs w:val="24"/>
+        </w:rPr>
+        <w:t xml:space="preserve">• Smoke test manual: el tesista recorre, vía 'rasa shell', las 50 intenciones del corpus una por una, confirmando que cada una dispara la respuesta correcta.</w:t>
+      </w:r>
+    </w:p>
+    <w:p>
+      <w:pPr>
+        <w:spacing w:after="0" w:line="480" w:lineRule="auto"/>
+        <w:ind w:firstLine="720"/>
+        <w:jc w:val="left"/>
+      </w:pPr>
+      <w:r>
+        <w:rPr>
+          <w:rFonts w:ascii="Times New Roman" w:cs="Times New Roman" w:eastAsia="Times New Roman" w:hAnsi="Times New Roman"/>
+          <w:color w:val="000000"/>
+          <w:sz w:val="24"/>
+          <w:szCs w:val="24"/>
+        </w:rPr>
+        <w:t xml:space="preserve">Criterio de salida de este nivel: cero conflictos detectados en la validación de datos, F1 preliminar razonable en la validación cruzada, y las 50 intenciones respondiendo sin errores en el smoke test. Solo al cumplirse estos tres criterios se avanza al pre-piloto con personas (Sección 2.12). Cualquier falla encontrada aquí se corrige y se documenta en incident_log.csv (P16) antes de continuar.</w:t>
+      </w:r>
+    </w:p>
+    <w:p>
+      <w:pPr>
+        <w:pStyle w:val="Heading2"/>
+        <w:spacing w:after="120" w:before="240" w:line="480" w:lineRule="auto"/>
+        <w:jc w:val="left"/>
+      </w:pPr>
+      <w:r>
+        <w:rPr>
+          <w:rFonts w:ascii="Times New Roman" w:cs="Times New Roman" w:eastAsia="Times New Roman" w:hAnsi="Times New Roman"/>
+          <w:b/>
+          <w:bCs/>
+          <w:color w:val="000000"/>
+          <w:sz w:val="24"/>
+          <w:szCs w:val="24"/>
+        </w:rPr>
+        <w:t xml:space="preserve">2.12 Pre-piloto y validación del instrumento</w:t>
+      </w:r>
+    </w:p>
+    <w:p>
+      <w:pPr>
+        <w:spacing w:after="0" w:line="480" w:lineRule="auto"/>
+        <w:ind w:firstLine="720"/>
+        <w:jc w:val="left"/>
+      </w:pPr>
+      <w:r>
+        <w:rPr>
+          <w:rFonts w:ascii="Times New Roman" w:cs="Times New Roman" w:eastAsia="Times New Roman" w:hAnsi="Times New Roman"/>
+          <w:color w:val="000000"/>
+          <w:sz w:val="24"/>
+          <w:szCs w:val="24"/>
+        </w:rPr>
+        <w:t xml:space="preserve">Antes del piloto a escala completa (OE3–OE4, n ≈ 120) se ejecuta un pre-piloto de validación, con dos propósitos: (a) verificar que la arquitectura fijada en OE2 funciona de manera estable fuera del entorno de entrenamiento, y (b) validar la consistencia interna del instrumento de satisfacción (encuesta Likert) antes de aplicarlo a la muestra real.</w:t>
+      </w:r>
+    </w:p>
+    <w:p>
+      <w:pPr>
+        <w:spacing w:after="0" w:line="480" w:lineRule="auto"/>
+        <w:ind w:firstLine="720"/>
+        <w:jc w:val="left"/>
+      </w:pPr>
+      <w:r>
+        <w:rPr>
+          <w:rFonts w:ascii="Times New Roman" w:cs="Times New Roman" w:eastAsia="Times New Roman" w:hAnsi="Times New Roman"/>
+          <w:color w:val="000000"/>
+          <w:sz w:val="24"/>
+          <w:szCs w:val="24"/>
+        </w:rPr>
+        <w:t xml:space="preserve">Participantes del pre-piloto. Un grupo reducido de 5 a 15 personas (personal de la Plataforma de Atención y/o voluntarios que simulan consultas ciudadanas reales), distinto e independiente de los 120 ciudadanos que luego integrarán la muestra oficial de OE4; estas personas no vuelven a participar en el piloto final, para no contaminar la muestra.</w:t>
+      </w:r>
+    </w:p>
+    <w:p>
+      <w:pPr>
+        <w:spacing w:after="0" w:line="480" w:lineRule="auto"/>
+        <w:ind w:firstLine="720"/>
+        <w:jc w:val="left"/>
+      </w:pPr>
+      <w:r>
+        <w:rPr>
+          <w:rFonts w:ascii="Times New Roman" w:cs="Times New Roman" w:eastAsia="Times New Roman" w:hAnsi="Times New Roman"/>
+          <w:color w:val="000000"/>
+          <w:sz w:val="24"/>
+          <w:szCs w:val="24"/>
+        </w:rPr>
+        <w:t xml:space="preserve">Guion de prueba. Entre 15 y 20 consultas representativas (2 a 3 por cada una de las 9 categorías de intención del Corpus MPSR-Bot), ejecutadas sobre el chatbot ya desplegado en un entorno mínimo (widget web, canal de WhatsApp/Telegram, o un dispositivo en la Plataforma de Atención).</w:t>
+      </w:r>
+    </w:p>
+    <w:p>
+      <w:pPr>
+        <w:spacing w:after="0" w:line="480" w:lineRule="auto"/>
+        <w:ind w:firstLine="720"/>
+        <w:jc w:val="left"/>
+      </w:pPr>
+      <w:r>
+        <w:rPr>
+          <w:rFonts w:ascii="Times New Roman" w:cs="Times New Roman" w:eastAsia="Times New Roman" w:hAnsi="Times New Roman"/>
+          <w:color w:val="000000"/>
+          <w:sz w:val="24"/>
+          <w:szCs w:val="24"/>
+        </w:rPr>
+        <w:t xml:space="preserve">Validación del instrumento. El mismo grupo responde la encuesta de satisfacción (Sección II, ítems de escala Likert) y se calcula el Alfa de Cronbach sobre esos ítems; un valor ≥ 0.70 se considera consistencia interna aceptable. Si el resultado es menor, se revisan y ajustan los ítems antes de aplicar la encuesta a los 120 ciudadanos.</w:t>
+      </w:r>
+    </w:p>
+    <w:p>
+      <w:pPr>
+        <w:spacing w:after="0" w:line="480" w:lineRule="auto"/>
+        <w:ind w:firstLine="720"/>
+        <w:jc w:val="left"/>
+      </w:pPr>
+      <w:r>
+        <w:rPr>
+          <w:rFonts w:ascii="Times New Roman" w:cs="Times New Roman" w:eastAsia="Times New Roman" w:hAnsi="Times New Roman"/>
+          <w:color w:val="000000"/>
+          <w:sz w:val="24"/>
+          <w:szCs w:val="24"/>
+        </w:rPr>
+        <w:t xml:space="preserve">Criterio de salida del pre-piloto. Se pasa al piloto a escala completa (P12) solo si se cumplen, de manera simultánea: F1 ≥ 0.75 sobre el guion de prueba (umbral más permisivo que el F1 ≥ 0.85 exigido en la evaluación final de OE2, porque aquí el modelo puede no estar aún óptimamente ajustado) y Alfa de Cronbach ≥ 0.70 en el instrumento. Toda incidencia detectada durante el pre-piloto (respuesta incorrecta, caída del servicio, ítem de encuesta confuso, etc.) se registra en incident_log.csv (P16) y se corrige antes de avanzar.</w:t>
+      </w:r>
+    </w:p>
+    <w:p>
+      <w:pPr>
+        <w:pStyle w:val="Heading2"/>
+        <w:spacing w:after="120" w:before="240" w:line="480" w:lineRule="auto"/>
+        <w:jc w:val="left"/>
+      </w:pPr>
+      <w:r>
+        <w:rPr>
+          <w:rFonts w:ascii="Times New Roman" w:cs="Times New Roman" w:eastAsia="Times New Roman" w:hAnsi="Times New Roman"/>
+          <w:b/>
+          <w:bCs/>
+          <w:color w:val="000000"/>
+          <w:sz w:val="24"/>
+          <w:szCs w:val="24"/>
+        </w:rPr>
+        <w:t xml:space="preserve">2.13 Evaluación del efecto en la atención ciudadana (OE1 → OE3 → OE4)</w:t>
+      </w:r>
+    </w:p>
+    <w:p>
+      <w:pPr>
+        <w:spacing w:after="0" w:line="480" w:lineRule="auto"/>
+        <w:ind w:firstLine="720"/>
+        <w:jc w:val="left"/>
+      </w:pPr>
+      <w:r>
+        <w:rPr>
+          <w:rFonts w:ascii="Times New Roman" w:cs="Times New Roman" w:eastAsia="Times New Roman" w:hAnsi="Times New Roman"/>
+          <w:color w:val="000000"/>
+          <w:sz w:val="24"/>
+          <w:szCs w:val="24"/>
+        </w:rPr>
+        <w:t xml:space="preserve">Todos los métodos de clasificación se evalúan bajo las mismas condiciones (mismas particiones y semillas) para fijar la arquitectura de OE2. El efecto del chatbot sobre la atención ciudadana se evalúa mediante el diseño pre-test/post-test de un solo grupo (Sección 2.4, n = 120): el pre-test es el diagnóstico de OE1 (tiempos, limitaciones y satisfacción con la atención presencial/TramiFácil) y el post-test es la medición de OE3 (tiempo de respuesta con el chatbot) y OE4 (satisfacción ciudadana), aplicados sobre los mismos sujetos. Antes de aplicar la prueba de hipótesis se verificará el supuesto de normalidad de las diferencias pre/post con la prueba de Shapiro-Wilk (α = 0.05): si se cumple la normalidad, se aplica la prueba t de Student para muestras pareadas; si no se cumple, se aplica su alternativa no paramétrica, la prueba de Wilcoxon (rangos con signo), manteniendo el mismo nivel de significancia α = 0.05.</w:t>
       </w:r>
     </w:p>
     <w:p>
@@ -1223,7 +1467,7 @@
           <w:sz w:val="24"/>
           <w:szCs w:val="24"/>
         </w:rPr>
-        <w:t xml:space="preserve">3. Protocolo experimental V1.0</w:t>
+        <w:t xml:space="preserve">3. Protocolo experimental V1.1</w:t>
       </w:r>
     </w:p>
     <w:p>
@@ -1241,7 +1485,7 @@
           <w:sz w:val="24"/>
           <w:szCs w:val="24"/>
         </w:rPr>
-        <w:t xml:space="preserve">El protocolo convierte la metodología en pasos concretos de ejecución. El flujo experimental general es: Corpus MPSR-Bot → auditoría → control de fuga → partición → preprocesamiento → entrenamiento (baseline y Rasa/DIET) → repeticiones → evaluación funcional → validación con usuarios (piloto) → verificación de supuestos → análisis estadístico → reproducibilidad → incidencias.</w:t>
+        <w:t xml:space="preserve">El protocolo convierte la metodología en pasos concretos de ejecución. El flujo experimental general es: Corpus MPSR-Bot → auditoría → control de fuga → partición → preprocesamiento → entrenamiento (baseline y Rasa/DIET) → repeticiones → evaluación funcional → pruebas técnicas internas → pre-piloto y validación del instrumento → piloto a escala completa → verificación de supuestos → análisis estadístico → reproducibilidad → incidencias.</w:t>
       </w:r>
     </w:p>
     <w:tbl>
@@ -1455,7 +1699,7 @@
                 <w:sz w:val="20"/>
                 <w:szCs w:val="20"/>
               </w:rPr>
-              <w:t xml:space="preserve">Relevar tiempos de la atención presencial y de TramiFácil. Instrumento: ficha de observación/registro de tiempos aplicada por el personal de la Plataforma durante 2 semanas. Muestreo estratificado por las 9 categorías (afijación proporcional), tamaño calculado con fórmula de poblaciones finitas (Z=1.96, p=q=0.5, e=5%, N=promedio mensual de atenciones MPSR; referencia preliminar n≈120 con N≈400 y e=7.5%). Mínimo 10 observaciones por categoría. Constituye la línea base (pre-test) para OE3.</w:t>
+              <w:t xml:space="preserve">Relevar, mediante autoreporte retrospectivo (Ficha de Diagnóstico P01), la experiencia de los últimos 12 meses con la atención presencial (TramiFácil es uso interno del personal, no se reporta como canal ciudadano). Reclutamiento: estudios contables/jurídicos de Juliaca (muestreo por cuotas, mín. 3/categoría, ver Sección 2.4). Se solicita WhatsApp solo para seguimiento. Tamaño: n=120, fórmula de poblaciones finitas (Z=1.96, p=q=0.5, e=5%, N=promedio mensual MPSR; referencia preliminar n≈120 con N≈400 y e=7.5%). Constituye el pre-test (línea base) para OE3-OE4 sobre los MISMOS sujetos.</w:t>
             </w:r>
           </w:p>
         </w:tc>
@@ -2469,7 +2713,7 @@
                 <w:sz w:val="20"/>
                 <w:szCs w:val="20"/>
               </w:rPr>
-              <w:t xml:space="preserve">P12</w:t>
+              <w:t xml:space="preserve">P11.1</w:t>
             </w:r>
           </w:p>
         </w:tc>
@@ -2501,7 +2745,7 @@
                 <w:sz w:val="20"/>
                 <w:szCs w:val="20"/>
               </w:rPr>
-              <w:t xml:space="preserve">Despliegue piloto y medición de tiempos (OE3)</w:t>
+              <w:t xml:space="preserve">Pruebas técnicas internas (OE2)</w:t>
             </w:r>
           </w:p>
         </w:tc>
@@ -2533,7 +2777,7 @@
                 <w:sz w:val="20"/>
                 <w:szCs w:val="20"/>
               </w:rPr>
-              <w:t xml:space="preserve">Desplegar el chatbot con la arquitectura fijada en la Plataforma de Atención Ciudadano MPSR; medir tiempo de respuesta y compararlo contra la línea base de P01.</w:t>
+              <w:t xml:space="preserve">Sin involucrar personas externas: 'rasa data validate' (conflictos stories/rules), 'rasa test nlu --cross-validation' (F1 preliminar), 'rasa test core' (predicción de acciones), pruebas unitarias de custom actions (pytest) y smoke test manual de las 50 intenciones vía 'rasa shell'. Criterio de salida: 0 conflictos, F1 preliminar razonable, 50/50 intenciones sin error. Ver Sección 2.11.</w:t>
             </w:r>
           </w:p>
         </w:tc>
@@ -2567,7 +2811,7 @@
                 <w:sz w:val="20"/>
                 <w:szCs w:val="20"/>
               </w:rPr>
-              <w:t xml:space="preserve">P13</w:t>
+              <w:t xml:space="preserve">P11.2</w:t>
             </w:r>
           </w:p>
         </w:tc>
@@ -2599,7 +2843,7 @@
                 <w:sz w:val="20"/>
                 <w:szCs w:val="20"/>
               </w:rPr>
-              <w:t xml:space="preserve">Encuesta de satisfacción (OE4)</w:t>
+              <w:t xml:space="preserve">Pre-piloto de validación (OE2–OE4)</w:t>
             </w:r>
           </w:p>
         </w:tc>
@@ -2631,7 +2875,7 @@
                 <w:sz w:val="20"/>
                 <w:szCs w:val="20"/>
               </w:rPr>
-              <w:t xml:space="preserve">Muestreo aleatorio simple entre ciudadanos que completen una interacción con el chatbot (inclusión: recibieron respuesta; exclusión: conversación abandonada). Aplicar encuesta con escala Likert de 5 puntos a n=120, justificado con fórmula de poblaciones finitas (Z=1.96, p=q=0.5, e=7.5%, N≈400) y coincidente con Vargas Ríos (2022).</w:t>
+              <w:t xml:space="preserve">Una vez superado P11.1, desplegar un entorno mínimo del chatbot y probarlo con 5–15 personas ajenas a la muestra final, usando un guion de 15–20 consultas (2–3 por categoría). Aplicar la encuesta de satisfacción a ese mismo grupo y calcular Alfa de Cronbach (≥ 0.70). Criterio de salida: F1 ≥ 0.75 en el guion + Alfa ≥ 0.70. Ver Sección 2.12.</w:t>
             </w:r>
           </w:p>
         </w:tc>
@@ -2665,7 +2909,7 @@
                 <w:sz w:val="20"/>
                 <w:szCs w:val="20"/>
               </w:rPr>
-              <w:t xml:space="preserve">P14</w:t>
+              <w:t xml:space="preserve">P12</w:t>
             </w:r>
           </w:p>
         </w:tc>
@@ -2697,7 +2941,7 @@
                 <w:sz w:val="20"/>
                 <w:szCs w:val="20"/>
               </w:rPr>
-              <w:t xml:space="preserve">Análisis estadístico (OE3–OE4)</w:t>
+              <w:t xml:space="preserve">Despliegue piloto y medición de tiempos (OE3)</w:t>
             </w:r>
           </w:p>
         </w:tc>
@@ -2729,7 +2973,7 @@
                 <w:sz w:val="20"/>
                 <w:szCs w:val="20"/>
               </w:rPr>
-              <w:t xml:space="preserve">Verificar normalidad de las diferencias pre/post con Shapiro-Wilk (α=0.05). Si se cumple, aplicar prueba t de Student pareada; si no, aplicar la alternativa no paramétrica Wilcoxon (rangos con signo). Formular H0/H1 y aplicar el criterio de decisión con α=0.05.</w:t>
+              <w:t xml:space="preserve">Una vez superado el pre-piloto (P11.2), desplegar el chatbot en un canal propio (WhatsApp/Telegram/web — sin integración con la MPSR). Recontactar (vía WhatsApp) a los mismos sujetos de P01 para que usen el chatbot; medir su tiempo de respuesta y compararlo contra su propia línea base de P01 (post-test pareado).</w:t>
             </w:r>
           </w:p>
         </w:tc>
@@ -2763,7 +3007,7 @@
                 <w:sz w:val="20"/>
                 <w:szCs w:val="20"/>
               </w:rPr>
-              <w:t xml:space="preserve">P15</w:t>
+              <w:t xml:space="preserve">P13</w:t>
             </w:r>
           </w:p>
         </w:tc>
@@ -2795,7 +3039,7 @@
                 <w:sz w:val="20"/>
                 <w:szCs w:val="20"/>
               </w:rPr>
-              <w:t xml:space="preserve">Reproducibilidad</w:t>
+              <w:t xml:space="preserve">Encuesta de satisfacción (OE4)</w:t>
             </w:r>
           </w:p>
         </w:tc>
@@ -2827,7 +3071,7 @@
                 <w:sz w:val="20"/>
                 <w:szCs w:val="20"/>
               </w:rPr>
-              <w:t xml:space="preserve">Conservar código, configuraciones, semillas, particiones, modelos, predicciones, métricas, logs y un README con el orden de ejecución.</w:t>
+              <w:t xml:space="preserve">A los mismos sujetos de P01 que completaron una interacción con el chatbot (inclusión: recibieron respuesta; exclusión: conversación abandonada, o haber participado en P11.2), aplicar la encuesta con escala Likert de 5 puntos (post-test). n=120, justificado con fórmula de poblaciones finitas (Z=1.96, p=q=0.5, e=7.5%, N≈400) y coincidente con Vargas Ríos (2022).</w:t>
             </w:r>
           </w:p>
         </w:tc>
@@ -2861,7 +3105,7 @@
                 <w:sz w:val="20"/>
                 <w:szCs w:val="20"/>
               </w:rPr>
-              <w:t xml:space="preserve">P16</w:t>
+              <w:t xml:space="preserve">P14</w:t>
             </w:r>
           </w:p>
         </w:tc>
@@ -2893,7 +3137,7 @@
                 <w:sz w:val="20"/>
                 <w:szCs w:val="20"/>
               </w:rPr>
-              <w:t xml:space="preserve">Registro de incidencias</w:t>
+              <w:t xml:space="preserve">Análisis estadístico (OE3–OE4)</w:t>
             </w:r>
           </w:p>
         </w:tc>
@@ -2925,7 +3169,203 @@
                 <w:sz w:val="20"/>
                 <w:szCs w:val="20"/>
               </w:rPr>
-              <w:t xml:space="preserve">Documentar fecha, experimento, incidencia, decisión adoptada y justificación de toda desviación del protocolo (p. ej. reetiquetado, falla de despliegue).</w:t>
+              <w:t xml:space="preserve">Verificar normalidad de las diferencias pre/post (mismos sujetos) con Shapiro-Wilk (α=0.05). Si se cumple, aplicar prueba t de Student pareada; si no, aplicar la alternativa no paramétrica Wilcoxon (rangos con signo). Formular H0/H1 y aplicar el criterio de decisión con α=0.05.</w:t>
+            </w:r>
+          </w:p>
+        </w:tc>
+      </w:tr>
+      <w:tr>
+        <w:tc>
+          <w:tcPr>
+            <w:tcW w:type="dxa" w:w="700"/>
+            <w:shd w:fill="FFFFFF" w:val="clear"/>
+            <w:tcMar>
+              <w:top w:type="dxa" w:w="60"/>
+              <w:left w:type="dxa" w:w="80"/>
+              <w:bottom w:type="dxa" w:w="60"/>
+              <w:right w:type="dxa" w:w="80"/>
+            </w:tcMar>
+            <w:vAlign w:val="center"/>
+          </w:tcPr>
+          <w:p>
+            <w:pPr>
+              <w:spacing w:line="240" w:lineRule="auto"/>
+              <w:jc w:val="center"/>
+            </w:pPr>
+            <w:r>
+              <w:rPr>
+                <w:rFonts w:ascii="Times New Roman" w:cs="Times New Roman" w:eastAsia="Times New Roman" w:hAnsi="Times New Roman"/>
+                <w:b/>
+                <w:bCs/>
+                <w:i w:val="false"/>
+                <w:iCs w:val="false"/>
+                <w:color w:val="000000"/>
+                <w:sz w:val="20"/>
+                <w:szCs w:val="20"/>
+              </w:rPr>
+              <w:t xml:space="preserve">P15</w:t>
+            </w:r>
+          </w:p>
+        </w:tc>
+        <w:tc>
+          <w:tcPr>
+            <w:tcW w:type="dxa" w:w="2400"/>
+            <w:shd w:fill="FFFFFF" w:val="clear"/>
+            <w:tcMar>
+              <w:top w:type="dxa" w:w="60"/>
+              <w:left w:type="dxa" w:w="80"/>
+              <w:bottom w:type="dxa" w:w="60"/>
+              <w:right w:type="dxa" w:w="80"/>
+            </w:tcMar>
+            <w:vAlign w:val="center"/>
+          </w:tcPr>
+          <w:p>
+            <w:pPr>
+              <w:spacing w:line="240" w:lineRule="auto"/>
+              <w:jc w:val="left"/>
+            </w:pPr>
+            <w:r>
+              <w:rPr>
+                <w:rFonts w:ascii="Times New Roman" w:cs="Times New Roman" w:eastAsia="Times New Roman" w:hAnsi="Times New Roman"/>
+                <w:b/>
+                <w:bCs/>
+                <w:i w:val="false"/>
+                <w:iCs w:val="false"/>
+                <w:color w:val="000000"/>
+                <w:sz w:val="20"/>
+                <w:szCs w:val="20"/>
+              </w:rPr>
+              <w:t xml:space="preserve">Reproducibilidad</w:t>
+            </w:r>
+          </w:p>
+        </w:tc>
+        <w:tc>
+          <w:tcPr>
+            <w:tcW w:type="dxa" w:w="6900"/>
+            <w:shd w:fill="FFFFFF" w:val="clear"/>
+            <w:tcMar>
+              <w:top w:type="dxa" w:w="60"/>
+              <w:left w:type="dxa" w:w="80"/>
+              <w:bottom w:type="dxa" w:w="60"/>
+              <w:right w:type="dxa" w:w="80"/>
+            </w:tcMar>
+            <w:vAlign w:val="center"/>
+          </w:tcPr>
+          <w:p>
+            <w:pPr>
+              <w:spacing w:line="240" w:lineRule="auto"/>
+              <w:jc w:val="left"/>
+            </w:pPr>
+            <w:r>
+              <w:rPr>
+                <w:rFonts w:ascii="Times New Roman" w:cs="Times New Roman" w:eastAsia="Times New Roman" w:hAnsi="Times New Roman"/>
+                <w:b w:val="false"/>
+                <w:bCs w:val="false"/>
+                <w:i w:val="false"/>
+                <w:iCs w:val="false"/>
+                <w:color w:val="000000"/>
+                <w:sz w:val="20"/>
+                <w:szCs w:val="20"/>
+              </w:rPr>
+              <w:t xml:space="preserve">Conservar código, configuraciones, semillas, particiones, modelos, predicciones, métricas, logs y un README con el orden de ejecución.</w:t>
+            </w:r>
+          </w:p>
+        </w:tc>
+      </w:tr>
+      <w:tr>
+        <w:tc>
+          <w:tcPr>
+            <w:tcW w:type="dxa" w:w="700"/>
+            <w:shd w:fill="F2F2F2" w:val="clear"/>
+            <w:tcMar>
+              <w:top w:type="dxa" w:w="60"/>
+              <w:left w:type="dxa" w:w="80"/>
+              <w:bottom w:type="dxa" w:w="60"/>
+              <w:right w:type="dxa" w:w="80"/>
+            </w:tcMar>
+            <w:vAlign w:val="center"/>
+          </w:tcPr>
+          <w:p>
+            <w:pPr>
+              <w:spacing w:line="240" w:lineRule="auto"/>
+              <w:jc w:val="center"/>
+            </w:pPr>
+            <w:r>
+              <w:rPr>
+                <w:rFonts w:ascii="Times New Roman" w:cs="Times New Roman" w:eastAsia="Times New Roman" w:hAnsi="Times New Roman"/>
+                <w:b/>
+                <w:bCs/>
+                <w:i w:val="false"/>
+                <w:iCs w:val="false"/>
+                <w:color w:val="000000"/>
+                <w:sz w:val="20"/>
+                <w:szCs w:val="20"/>
+              </w:rPr>
+              <w:t xml:space="preserve">P16</w:t>
+            </w:r>
+          </w:p>
+        </w:tc>
+        <w:tc>
+          <w:tcPr>
+            <w:tcW w:type="dxa" w:w="2400"/>
+            <w:shd w:fill="F2F2F2" w:val="clear"/>
+            <w:tcMar>
+              <w:top w:type="dxa" w:w="60"/>
+              <w:left w:type="dxa" w:w="80"/>
+              <w:bottom w:type="dxa" w:w="60"/>
+              <w:right w:type="dxa" w:w="80"/>
+            </w:tcMar>
+            <w:vAlign w:val="center"/>
+          </w:tcPr>
+          <w:p>
+            <w:pPr>
+              <w:spacing w:line="240" w:lineRule="auto"/>
+              <w:jc w:val="left"/>
+            </w:pPr>
+            <w:r>
+              <w:rPr>
+                <w:rFonts w:ascii="Times New Roman" w:cs="Times New Roman" w:eastAsia="Times New Roman" w:hAnsi="Times New Roman"/>
+                <w:b/>
+                <w:bCs/>
+                <w:i w:val="false"/>
+                <w:iCs w:val="false"/>
+                <w:color w:val="000000"/>
+                <w:sz w:val="20"/>
+                <w:szCs w:val="20"/>
+              </w:rPr>
+              <w:t xml:space="preserve">Registro de incidencias</w:t>
+            </w:r>
+          </w:p>
+        </w:tc>
+        <w:tc>
+          <w:tcPr>
+            <w:tcW w:type="dxa" w:w="6900"/>
+            <w:shd w:fill="F2F2F2" w:val="clear"/>
+            <w:tcMar>
+              <w:top w:type="dxa" w:w="60"/>
+              <w:left w:type="dxa" w:w="80"/>
+              <w:bottom w:type="dxa" w:w="60"/>
+              <w:right w:type="dxa" w:w="80"/>
+            </w:tcMar>
+            <w:vAlign w:val="center"/>
+          </w:tcPr>
+          <w:p>
+            <w:pPr>
+              <w:spacing w:line="240" w:lineRule="auto"/>
+              <w:jc w:val="left"/>
+            </w:pPr>
+            <w:r>
+              <w:rPr>
+                <w:rFonts w:ascii="Times New Roman" w:cs="Times New Roman" w:eastAsia="Times New Roman" w:hAnsi="Times New Roman"/>
+                <w:b w:val="false"/>
+                <w:bCs w:val="false"/>
+                <w:i w:val="false"/>
+                <w:iCs w:val="false"/>
+                <w:color w:val="000000"/>
+                <w:sz w:val="20"/>
+                <w:szCs w:val="20"/>
+              </w:rPr>
+              <w:t xml:space="preserve">Documentar fecha, experimento, incidencia, decisión adoptada y justificación de toda desviación del protocolo (p. ej. reetiquetado, falla de despliegue, ajuste de ítems tras el pre-piloto).</w:t>
             </w:r>
           </w:p>
         </w:tc>
@@ -3464,7 +3904,7 @@
                 <w:sz w:val="14"/>
                 <w:szCs w:val="14"/>
               </w:rPr>
-              <w:t xml:space="preserve">Relevar tiempos y limitaciones de la atención presencial.</w:t>
+              <w:t xml:space="preserve">Relevar, vía autoreporte, tiempos y limitaciones de la atención presencial (TramiFácil es uso interno).</w:t>
             </w:r>
           </w:p>
         </w:tc>
@@ -3496,7 +3936,7 @@
                 <w:sz w:val="14"/>
                 <w:szCs w:val="14"/>
               </w:rPr>
-              <w:t xml:space="preserve">Registros/observación de atención presencial.</w:t>
+              <w:t xml:space="preserve">Ficha de Diagnóstico P01 (120 sujetos reclutados en estudios contables/jurídicos).</w:t>
             </w:r>
           </w:p>
         </w:tc>
@@ -3528,7 +3968,7 @@
                 <w:sz w:val="14"/>
                 <w:szCs w:val="14"/>
               </w:rPr>
-              <w:t xml:space="preserve">Medición de tiempos y cuellos de botella.</w:t>
+              <w:t xml:space="preserve">Medición retrospectiva de tiempos y cuellos de botella; se registra WhatsApp para seguimiento.</w:t>
             </w:r>
           </w:p>
         </w:tc>
@@ -3560,7 +4000,7 @@
                 <w:sz w:val="14"/>
                 <w:szCs w:val="14"/>
               </w:rPr>
-              <w:t xml:space="preserve">Muestra de trámites representativa de las 9 categorías.</w:t>
+              <w:t xml:space="preserve">Muestra por cuotas (9 categorías), n=120 (fórmula poblaciones finitas, ver 2.4.1).</w:t>
             </w:r>
           </w:p>
         </w:tc>
@@ -3592,7 +4032,7 @@
                 <w:sz w:val="14"/>
                 <w:szCs w:val="14"/>
               </w:rPr>
-              <w:t xml:space="preserve">Informe de diagnóstico presencial.</w:t>
+              <w:t xml:space="preserve">Informe de diagnóstico + base de contactos.</w:t>
             </w:r>
           </w:p>
         </w:tc>
@@ -3624,7 +4064,7 @@
                 <w:sz w:val="14"/>
                 <w:szCs w:val="14"/>
               </w:rPr>
-              <w:t xml:space="preserve">Tiempo promedio de atención (línea base).</w:t>
+              <w:t xml:space="preserve">Tiempo promedio reportado (línea base).</w:t>
             </w:r>
           </w:p>
         </w:tc>
@@ -3656,7 +4096,7 @@
                 <w:sz w:val="14"/>
                 <w:szCs w:val="14"/>
               </w:rPr>
-              <w:t xml:space="preserve">Línea base (pre-test) para OE3.</w:t>
+              <w:t xml:space="preserve">Pre-test; mismos sujetos se recontactan en T08-T11.</w:t>
             </w:r>
           </w:p>
         </w:tc>
@@ -5430,7 +5870,7 @@
                 <w:sz w:val="14"/>
                 <w:szCs w:val="14"/>
               </w:rPr>
-              <w:t xml:space="preserve">T08</w:t>
+              <w:t xml:space="preserve">T07.1</w:t>
             </w:r>
           </w:p>
         </w:tc>
@@ -5462,7 +5902,7 @@
                 <w:sz w:val="14"/>
                 <w:szCs w:val="14"/>
               </w:rPr>
-              <w:t xml:space="preserve">OE3. Medir la reducción del tiempo de respuesta.</w:t>
+              <w:t xml:space="preserve">OE2</w:t>
             </w:r>
           </w:p>
         </w:tc>
@@ -5494,7 +5934,7 @@
                 <w:sz w:val="14"/>
                 <w:szCs w:val="14"/>
               </w:rPr>
-              <w:t xml:space="preserve">Desplegar el chatbot en la Plataforma MPSR.</w:t>
+              <w:t xml:space="preserve">Ejecutar pruebas técnicas internas.</w:t>
             </w:r>
           </w:p>
         </w:tc>
@@ -5526,7 +5966,7 @@
                 <w:sz w:val="14"/>
                 <w:szCs w:val="14"/>
               </w:rPr>
-              <w:t xml:space="preserve">Chatbot funcional (OE2) + Plataforma de Atención.</w:t>
+              <w:t xml:space="preserve">Chatbot funcional (T07): NLU + gestión del diálogo.</w:t>
             </w:r>
           </w:p>
         </w:tc>
@@ -5558,7 +5998,7 @@
                 <w:sz w:val="14"/>
                 <w:szCs w:val="14"/>
               </w:rPr>
-              <w:t xml:space="preserve">Poner en producción piloto el chatbot.</w:t>
+              <w:t xml:space="preserve">rasa data validate, rasa test nlu/core, pruebas unitarias de actions, smoke test de las 50 intenciones.</w:t>
             </w:r>
           </w:p>
         </w:tc>
@@ -5590,7 +6030,7 @@
                 <w:sz w:val="14"/>
                 <w:szCs w:val="14"/>
               </w:rPr>
-              <w:t xml:space="preserve">Mismo periodo/condiciones que el diagnóstico de OE1.</w:t>
+              <w:t xml:space="preserve">0 conflictos; F1 preliminar razonable; 50/50 intenciones sin error.</w:t>
             </w:r>
           </w:p>
         </w:tc>
@@ -5622,7 +6062,7 @@
                 <w:sz w:val="14"/>
                 <w:szCs w:val="14"/>
               </w:rPr>
-              <w:t xml:space="preserve">Registro de despliegue.</w:t>
+              <w:t xml:space="preserve">Reportes de validate/test + log del smoke test.</w:t>
             </w:r>
           </w:p>
         </w:tc>
@@ -5654,7 +6094,7 @@
                 <w:sz w:val="14"/>
                 <w:szCs w:val="14"/>
               </w:rPr>
-              <w:t xml:space="preserve">Disponibilidad del canal (24/7).</w:t>
+              <w:t xml:space="preserve">N.º de conflictos, F1 preliminar, intenciones sin error.</w:t>
             </w:r>
           </w:p>
         </w:tc>
@@ -5686,7 +6126,7 @@
                 <w:sz w:val="14"/>
                 <w:szCs w:val="14"/>
               </w:rPr>
-              <w:t xml:space="preserve">Chatbot operativo para medición.</w:t>
+              <w:t xml:space="preserve">Sistema técnicamente estable antes de involucrar personas.</w:t>
             </w:r>
           </w:p>
         </w:tc>
@@ -5720,7 +6160,7 @@
                 <w:sz w:val="14"/>
                 <w:szCs w:val="14"/>
               </w:rPr>
-              <w:t xml:space="preserve">T09</w:t>
+              <w:t xml:space="preserve">T07.2</w:t>
             </w:r>
           </w:p>
         </w:tc>
@@ -5752,7 +6192,7 @@
                 <w:sz w:val="14"/>
                 <w:szCs w:val="14"/>
               </w:rPr>
-              <w:t xml:space="preserve">OE3</w:t>
+              <w:t xml:space="preserve">OE2-OE4</w:t>
             </w:r>
           </w:p>
         </w:tc>
@@ -5784,7 +6224,7 @@
                 <w:sz w:val="14"/>
                 <w:szCs w:val="14"/>
               </w:rPr>
-              <w:t xml:space="preserve">Medir tiempo de respuesta con el chatbot.</w:t>
+              <w:t xml:space="preserve">Ejecutar el pre-piloto y validar el instrumento.</w:t>
             </w:r>
           </w:p>
         </w:tc>
@@ -5816,7 +6256,7 @@
                 <w:sz w:val="14"/>
                 <w:szCs w:val="14"/>
               </w:rPr>
-              <w:t xml:space="preserve">Consultas ciudadanas atendidas por el chatbot.</w:t>
+              <w:t xml:space="preserve">Chatbot verificado (T07.1) + encuesta de satisfacción.</w:t>
             </w:r>
           </w:p>
         </w:tc>
@@ -5848,7 +6288,7 @@
                 <w:sz w:val="14"/>
                 <w:szCs w:val="14"/>
               </w:rPr>
-              <w:t xml:space="preserve">Registrar tiempo de respuesta por consulta.</w:t>
+              <w:t xml:space="preserve">Probar con 5–15 personas ajenas a la muestra final (guion de 15–20 consultas) y aplicarles la encuesta.</w:t>
             </w:r>
           </w:p>
         </w:tc>
@@ -5880,7 +6320,7 @@
                 <w:sz w:val="14"/>
                 <w:szCs w:val="14"/>
               </w:rPr>
-              <w:t xml:space="preserve">Mismas categorías de trámite que la línea base (T01).</w:t>
+              <w:t xml:space="preserve">F1 ≥ 0.75 en el guion; Alfa de Cronbach ≥ 0.70.</w:t>
             </w:r>
           </w:p>
         </w:tc>
@@ -5912,7 +6352,7 @@
                 <w:sz w:val="14"/>
                 <w:szCs w:val="14"/>
               </w:rPr>
-              <w:t xml:space="preserve">Registros de tiempo (post-test).</w:t>
+              <w:t xml:space="preserve">Resultados del guion + respuestas de la encuesta piloto.</w:t>
             </w:r>
           </w:p>
         </w:tc>
@@ -5944,7 +6384,7 @@
                 <w:sz w:val="14"/>
                 <w:szCs w:val="14"/>
               </w:rPr>
-              <w:t xml:space="preserve">Tiempo promedio de respuesta (post).</w:t>
+              <w:t xml:space="preserve">F1 del guion y Alfa de Cronbach del instrumento.</w:t>
             </w:r>
           </w:p>
         </w:tc>
@@ -5976,7 +6416,7 @@
                 <w:sz w:val="14"/>
                 <w:szCs w:val="14"/>
               </w:rPr>
-              <w:t xml:space="preserve">Dato post-test para la comparación.</w:t>
+              <w:t xml:space="preserve">Decisión de avanzar al piloto completo o corregir modelo/instrumento.</w:t>
             </w:r>
           </w:p>
         </w:tc>
@@ -6010,7 +6450,7 @@
                 <w:sz w:val="14"/>
                 <w:szCs w:val="14"/>
               </w:rPr>
-              <w:t xml:space="preserve">T10</w:t>
+              <w:t xml:space="preserve">T08</w:t>
             </w:r>
           </w:p>
         </w:tc>
@@ -6042,7 +6482,7 @@
                 <w:sz w:val="14"/>
                 <w:szCs w:val="14"/>
               </w:rPr>
-              <w:t xml:space="preserve">OE3</w:t>
+              <w:t xml:space="preserve">OE3. Medir la reducción del tiempo de respuesta.</w:t>
             </w:r>
           </w:p>
         </w:tc>
@@ -6074,7 +6514,7 @@
                 <w:sz w:val="14"/>
                 <w:szCs w:val="14"/>
               </w:rPr>
-              <w:t xml:space="preserve">Comparar tiempos pre/post.</w:t>
+              <w:t xml:space="preserve">Desplegar el chatbot en un canal propio (WhatsApp/Telegram/web).</w:t>
             </w:r>
           </w:p>
         </w:tc>
@@ -6106,7 +6546,7 @@
                 <w:sz w:val="14"/>
                 <w:szCs w:val="14"/>
               </w:rPr>
-              <w:t xml:space="preserve">Línea base (T01) + tiempos del chatbot (T09).</w:t>
+              <w:t xml:space="preserve">Chatbot funcional (OE2), validado en T07.1 y T07.2.</w:t>
             </w:r>
           </w:p>
         </w:tc>
@@ -6138,7 +6578,7 @@
                 <w:sz w:val="14"/>
                 <w:szCs w:val="14"/>
               </w:rPr>
-              <w:t xml:space="preserve">Calcular porcentaje de reducción del tiempo de respuesta.</w:t>
+              <w:t xml:space="preserve">Poner en producción piloto el chatbot; recontactar vía WhatsApp a los sujetos de T01.</w:t>
             </w:r>
           </w:p>
         </w:tc>
@@ -6170,7 +6610,7 @@
                 <w:sz w:val="14"/>
                 <w:szCs w:val="14"/>
               </w:rPr>
-              <w:t xml:space="preserve">Mismo criterio de medición en ambos momentos.</w:t>
+              <w:t xml:space="preserve">Mismos sujetos de T01 (pareado); meta de retención ≥120.</w:t>
             </w:r>
           </w:p>
         </w:tc>
@@ -6202,7 +6642,7 @@
                 <w:sz w:val="14"/>
                 <w:szCs w:val="14"/>
               </w:rPr>
-              <w:t xml:space="preserve">Tabla comparativa pre/post.</w:t>
+              <w:t xml:space="preserve">Registro de despliegue + tasa de retención.</w:t>
             </w:r>
           </w:p>
         </w:tc>
@@ -6234,7 +6674,7 @@
                 <w:sz w:val="14"/>
                 <w:szCs w:val="14"/>
               </w:rPr>
-              <w:t xml:space="preserve">% de reducción de tiempo (meta ≥ 60 %).</w:t>
+              <w:t xml:space="preserve">Disponibilidad del canal (24/7).</w:t>
             </w:r>
           </w:p>
         </w:tc>
@@ -6266,7 +6706,7 @@
                 <w:sz w:val="14"/>
                 <w:szCs w:val="14"/>
               </w:rPr>
-              <w:t xml:space="preserve">Evidencia cuantitativa de mejora en el tiempo de atención.</w:t>
+              <w:t xml:space="preserve">Chatbot operativo para medición pareada.</w:t>
             </w:r>
           </w:p>
         </w:tc>
@@ -6300,7 +6740,7 @@
                 <w:sz w:val="14"/>
                 <w:szCs w:val="14"/>
               </w:rPr>
-              <w:t xml:space="preserve">T11</w:t>
+              <w:t xml:space="preserve">T09</w:t>
             </w:r>
           </w:p>
         </w:tc>
@@ -6332,7 +6772,7 @@
                 <w:sz w:val="14"/>
                 <w:szCs w:val="14"/>
               </w:rPr>
-              <w:t xml:space="preserve">OE4. Evaluar el nivel de satisfacción ciudadana.</w:t>
+              <w:t xml:space="preserve">OE3</w:t>
             </w:r>
           </w:p>
         </w:tc>
@@ -6364,7 +6804,7 @@
                 <w:sz w:val="14"/>
                 <w:szCs w:val="14"/>
               </w:rPr>
-              <w:t xml:space="preserve">Aplicar encuesta de usabilidad.</w:t>
+              <w:t xml:space="preserve">Medir tiempo de respuesta con el chatbot.</w:t>
             </w:r>
           </w:p>
         </w:tc>
@@ -6396,7 +6836,7 @@
                 <w:sz w:val="14"/>
                 <w:szCs w:val="14"/>
               </w:rPr>
-              <w:t xml:space="preserve">Ciudadanos que usaron el chatbot.</w:t>
+              <w:t xml:space="preserve">Consultas de los mismos sujetos de T01, atendidas por el chatbot.</w:t>
             </w:r>
           </w:p>
         </w:tc>
@@ -6428,7 +6868,7 @@
                 <w:sz w:val="14"/>
                 <w:szCs w:val="14"/>
               </w:rPr>
-              <w:t xml:space="preserve">Encuesta con escala Likert de 5 puntos.</w:t>
+              <w:t xml:space="preserve">Registrar tiempo de respuesta por consulta (post-test).</w:t>
             </w:r>
           </w:p>
         </w:tc>
@@ -6460,7 +6900,7 @@
                 <w:sz w:val="14"/>
                 <w:szCs w:val="14"/>
               </w:rPr>
-              <w:t xml:space="preserve">Muestra n = 120 (Vargas Ríos, 2022).</w:t>
+              <w:t xml:space="preserve">Mismas categorías de trámite y mismos sujetos que T01.</w:t>
             </w:r>
           </w:p>
         </w:tc>
@@ -6492,7 +6932,7 @@
                 <w:sz w:val="14"/>
                 <w:szCs w:val="14"/>
               </w:rPr>
-              <w:t xml:space="preserve">Base de datos de encuesta.</w:t>
+              <w:t xml:space="preserve">Registros de tiempo (post-test, pareados con T01).</w:t>
             </w:r>
           </w:p>
         </w:tc>
@@ -6524,7 +6964,7 @@
                 <w:sz w:val="14"/>
                 <w:szCs w:val="14"/>
               </w:rPr>
-              <w:t xml:space="preserve">Puntaje Likert promedio (meta ≥ 4.0/5.0).</w:t>
+              <w:t xml:space="preserve">Tiempo promedio de respuesta (post).</w:t>
             </w:r>
           </w:p>
         </w:tc>
@@ -6556,7 +6996,7 @@
                 <w:sz w:val="14"/>
                 <w:szCs w:val="14"/>
               </w:rPr>
-              <w:t xml:space="preserve">Nivel de satisfacción ciudadana documentado.</w:t>
+              <w:t xml:space="preserve">Dato post-test pareado para la comparación.</w:t>
             </w:r>
           </w:p>
         </w:tc>
@@ -6590,7 +7030,7 @@
                 <w:sz w:val="14"/>
                 <w:szCs w:val="14"/>
               </w:rPr>
-              <w:t xml:space="preserve">T12</w:t>
+              <w:t xml:space="preserve">T10</w:t>
             </w:r>
           </w:p>
         </w:tc>
@@ -6622,7 +7062,7 @@
                 <w:sz w:val="14"/>
                 <w:szCs w:val="14"/>
               </w:rPr>
-              <w:t xml:space="preserve">OE4</w:t>
+              <w:t xml:space="preserve">OE3</w:t>
             </w:r>
           </w:p>
         </w:tc>
@@ -6654,7 +7094,7 @@
                 <w:sz w:val="14"/>
                 <w:szCs w:val="14"/>
               </w:rPr>
-              <w:t xml:space="preserve">Analizar errores y percepción negativa.</w:t>
+              <w:t xml:space="preserve">Comparar tiempos pre/post (mismo sujeto).</w:t>
             </w:r>
           </w:p>
         </w:tc>
@@ -6686,7 +7126,7 @@
                 <w:sz w:val="14"/>
                 <w:szCs w:val="14"/>
               </w:rPr>
-              <w:t xml:space="preserve">Predicciones del chatbot + respuestas de la encuesta.</w:t>
+              <w:t xml:space="preserve">Línea base (T01) + tiempos del chatbot (T09), mismos sujetos.</w:t>
             </w:r>
           </w:p>
         </w:tc>
@@ -6718,7 +7158,7 @@
                 <w:sz w:val="14"/>
                 <w:szCs w:val="14"/>
               </w:rPr>
-              <w:t xml:space="preserve">Identificar intenciones confundidas y comentarios críticos.</w:t>
+              <w:t xml:space="preserve">Calcular diferencia y porcentaje de reducción del tiempo de respuesta por sujeto.</w:t>
             </w:r>
           </w:p>
         </w:tc>
@@ -6750,7 +7190,7 @@
                 <w:sz w:val="14"/>
                 <w:szCs w:val="14"/>
               </w:rPr>
-              <w:t xml:space="preserve">Criterios uniformes de análisis.</w:t>
+              <w:t xml:space="preserve">Comparación pareada; mismo criterio de medición en ambos momentos.</w:t>
             </w:r>
           </w:p>
         </w:tc>
@@ -6782,7 +7222,7 @@
                 <w:sz w:val="14"/>
                 <w:szCs w:val="14"/>
               </w:rPr>
-              <w:t xml:space="preserve">Matrices de confusión + comentarios de encuesta.</w:t>
+              <w:t xml:space="preserve">Tabla comparativa pre/post pareada.</w:t>
             </w:r>
           </w:p>
         </w:tc>
@@ -6814,7 +7254,7 @@
                 <w:sz w:val="14"/>
                 <w:szCs w:val="14"/>
               </w:rPr>
-              <w:t xml:space="preserve">FP/FN por intención; ítems Likert bajos.</w:t>
+              <w:t xml:space="preserve">% de reducción de tiempo (meta ≥ 60 %).</w:t>
             </w:r>
           </w:p>
         </w:tc>
@@ -6846,7 +7286,7 @@
                 <w:sz w:val="14"/>
                 <w:szCs w:val="14"/>
               </w:rPr>
-              <w:t xml:space="preserve">Explicación de patrones de error e insatisfacción.</w:t>
+              <w:t xml:space="preserve">Evidencia cuantitativa de mejora en el tiempo de atención.</w:t>
             </w:r>
           </w:p>
         </w:tc>
@@ -6880,7 +7320,7 @@
                 <w:sz w:val="14"/>
                 <w:szCs w:val="14"/>
               </w:rPr>
-              <w:t xml:space="preserve">T13</w:t>
+              <w:t xml:space="preserve">T11</w:t>
             </w:r>
           </w:p>
         </w:tc>
@@ -6912,7 +7352,7 @@
                 <w:sz w:val="14"/>
                 <w:szCs w:val="14"/>
               </w:rPr>
-              <w:t xml:space="preserve">OE1-OE4</w:t>
+              <w:t xml:space="preserve">OE4. Evaluar el nivel de satisfacción ciudadana.</w:t>
             </w:r>
           </w:p>
         </w:tc>
@@ -6944,7 +7384,7 @@
                 <w:sz w:val="14"/>
                 <w:szCs w:val="14"/>
               </w:rPr>
-              <w:t xml:space="preserve">Contrastar la hipótesis estadísticamente.</w:t>
+              <w:t xml:space="preserve">Aplicar encuesta de usabilidad (post-test).</w:t>
             </w:r>
           </w:p>
         </w:tc>
@@ -6976,7 +7416,7 @@
                 <w:sz w:val="14"/>
                 <w:szCs w:val="14"/>
               </w:rPr>
-              <w:t xml:space="preserve">Datos pre/post de tiempo (T01, T10) y satisfacción (T11).</w:t>
+              <w:t xml:space="preserve">Mismos sujetos de T01 que usaron el chatbot (excluye participantes de T07.2).</w:t>
             </w:r>
           </w:p>
         </w:tc>
@@ -7008,7 +7448,7 @@
                 <w:sz w:val="14"/>
                 <w:szCs w:val="14"/>
               </w:rPr>
-              <w:t xml:space="preserve">Verificar normalidad (Shapiro-Wilk) y aplicar prueba t de Student o, en su defecto, Wilcoxon.</w:t>
+              <w:t xml:space="preserve">Encuesta con escala Likert de 5 puntos.</w:t>
             </w:r>
           </w:p>
         </w:tc>
@@ -7040,7 +7480,7 @@
                 <w:sz w:val="14"/>
                 <w:szCs w:val="14"/>
               </w:rPr>
-              <w:t xml:space="preserve">α = 0.05; H0/H1 formales.</w:t>
+              <w:t xml:space="preserve">n=120 (Vargas Ríos, 2022), fórmula de poblaciones finitas (2.4.1).</w:t>
             </w:r>
           </w:p>
         </w:tc>
@@ -7072,7 +7512,7 @@
                 <w:sz w:val="14"/>
                 <w:szCs w:val="14"/>
               </w:rPr>
-              <w:t xml:space="preserve">Script + tabla estadística.</w:t>
+              <w:t xml:space="preserve">Base de datos de encuesta, pareada con T01.</w:t>
             </w:r>
           </w:p>
         </w:tc>
@@ -7104,7 +7544,7 @@
                 <w:sz w:val="14"/>
                 <w:szCs w:val="14"/>
               </w:rPr>
-              <w:t xml:space="preserve">p-value y decisión sobre H0.</w:t>
+              <w:t xml:space="preserve">Puntaje Likert promedio (meta ≥ 4.0/5.0).</w:t>
             </w:r>
           </w:p>
         </w:tc>
@@ -7136,7 +7576,7 @@
                 <w:sz w:val="14"/>
                 <w:szCs w:val="14"/>
               </w:rPr>
-              <w:t xml:space="preserve">Evidencia cuantitativa del efecto del chatbot en la atención ciudadana.</w:t>
+              <w:t xml:space="preserve">Nivel de satisfacción post documentado, comparable a la línea base de T01.</w:t>
             </w:r>
           </w:p>
         </w:tc>
@@ -7170,7 +7610,7 @@
                 <w:sz w:val="14"/>
                 <w:szCs w:val="14"/>
               </w:rPr>
-              <w:t xml:space="preserve">T14</w:t>
+              <w:t xml:space="preserve">T12</w:t>
             </w:r>
           </w:p>
         </w:tc>
@@ -7202,7 +7642,7 @@
                 <w:sz w:val="14"/>
                 <w:szCs w:val="14"/>
               </w:rPr>
-              <w:t xml:space="preserve">OE1-OE4</w:t>
+              <w:t xml:space="preserve">OE4</w:t>
             </w:r>
           </w:p>
         </w:tc>
@@ -7234,7 +7674,7 @@
                 <w:sz w:val="14"/>
                 <w:szCs w:val="14"/>
               </w:rPr>
-              <w:t xml:space="preserve">Garantizar reproducibilidad.</w:t>
+              <w:t xml:space="preserve">Analizar errores y percepción negativa.</w:t>
             </w:r>
           </w:p>
         </w:tc>
@@ -7266,7 +7706,7 @@
                 <w:sz w:val="14"/>
                 <w:szCs w:val="14"/>
               </w:rPr>
-              <w:t xml:space="preserve">Todos los experimentos.</w:t>
+              <w:t xml:space="preserve">Predicciones del chatbot + respuestas de la encuesta.</w:t>
             </w:r>
           </w:p>
         </w:tc>
@@ -7298,7 +7738,7 @@
                 <w:sz w:val="14"/>
                 <w:szCs w:val="14"/>
               </w:rPr>
-              <w:t xml:space="preserve">Integrar código, configuraciones, seeds, logs y resultados.</w:t>
+              <w:t xml:space="preserve">Identificar intenciones confundidas y comentarios críticos.</w:t>
             </w:r>
           </w:p>
         </w:tc>
@@ -7330,7 +7770,7 @@
                 <w:sz w:val="14"/>
                 <w:szCs w:val="14"/>
               </w:rPr>
-              <w:t xml:space="preserve">Versionado del protocolo y del software.</w:t>
+              <w:t xml:space="preserve">Criterios uniformes de análisis.</w:t>
             </w:r>
           </w:p>
         </w:tc>
@@ -7362,7 +7802,7 @@
                 <w:sz w:val="14"/>
                 <w:szCs w:val="14"/>
               </w:rPr>
-              <w:t xml:space="preserve">Repositorio + README.md</w:t>
+              <w:t xml:space="preserve">Matrices de confusión + comentarios de encuesta.</w:t>
             </w:r>
           </w:p>
         </w:tc>
@@ -7394,7 +7834,7 @@
                 <w:sz w:val="14"/>
                 <w:szCs w:val="14"/>
               </w:rPr>
-              <w:t xml:space="preserve">Experimento reproducible y rastreable.</w:t>
+              <w:t xml:space="preserve">FP/FN por intención; ítems Likert bajos.</w:t>
             </w:r>
           </w:p>
         </w:tc>
@@ -7426,7 +7866,7 @@
                 <w:sz w:val="14"/>
                 <w:szCs w:val="14"/>
               </w:rPr>
-              <w:t xml:space="preserve">Trazabilidad completa objetivo→resultado.</w:t>
+              <w:t xml:space="preserve">Explicación de patrones de error e insatisfacción.</w:t>
             </w:r>
           </w:p>
         </w:tc>
@@ -7460,7 +7900,7 @@
                 <w:sz w:val="14"/>
                 <w:szCs w:val="14"/>
               </w:rPr>
-              <w:t xml:space="preserve">T15</w:t>
+              <w:t xml:space="preserve">T13</w:t>
             </w:r>
           </w:p>
         </w:tc>
@@ -7524,6 +7964,586 @@
                 <w:sz w:val="14"/>
                 <w:szCs w:val="14"/>
               </w:rPr>
+              <w:t xml:space="preserve">Contrastar la hipótesis estadísticamente.</w:t>
+            </w:r>
+          </w:p>
+        </w:tc>
+        <w:tc>
+          <w:tcPr>
+            <w:tcW w:type="dxa" w:w="1300"/>
+            <w:shd w:fill="FFFFFF" w:val="clear"/>
+            <w:tcMar>
+              <w:top w:type="dxa" w:w="60"/>
+              <w:left w:type="dxa" w:w="80"/>
+              <w:bottom w:type="dxa" w:w="60"/>
+              <w:right w:type="dxa" w:w="80"/>
+            </w:tcMar>
+            <w:vAlign w:val="center"/>
+          </w:tcPr>
+          <w:p>
+            <w:pPr>
+              <w:spacing w:line="240" w:lineRule="auto"/>
+              <w:jc w:val="left"/>
+            </w:pPr>
+            <w:r>
+              <w:rPr>
+                <w:rFonts w:ascii="Times New Roman" w:cs="Times New Roman" w:eastAsia="Times New Roman" w:hAnsi="Times New Roman"/>
+                <w:b w:val="false"/>
+                <w:bCs w:val="false"/>
+                <w:i w:val="false"/>
+                <w:iCs w:val="false"/>
+                <w:color w:val="000000"/>
+                <w:sz w:val="14"/>
+                <w:szCs w:val="14"/>
+              </w:rPr>
+              <w:t xml:space="preserve">Datos pre/post de tiempo (T01, T10) y satisfacción (T11) — mismos sujetos.</w:t>
+            </w:r>
+          </w:p>
+        </w:tc>
+        <w:tc>
+          <w:tcPr>
+            <w:tcW w:type="dxa" w:w="1550"/>
+            <w:shd w:fill="FFFFFF" w:val="clear"/>
+            <w:tcMar>
+              <w:top w:type="dxa" w:w="60"/>
+              <w:left w:type="dxa" w:w="80"/>
+              <w:bottom w:type="dxa" w:w="60"/>
+              <w:right w:type="dxa" w:w="80"/>
+            </w:tcMar>
+            <w:vAlign w:val="center"/>
+          </w:tcPr>
+          <w:p>
+            <w:pPr>
+              <w:spacing w:line="240" w:lineRule="auto"/>
+              <w:jc w:val="left"/>
+            </w:pPr>
+            <w:r>
+              <w:rPr>
+                <w:rFonts w:ascii="Times New Roman" w:cs="Times New Roman" w:eastAsia="Times New Roman" w:hAnsi="Times New Roman"/>
+                <w:b w:val="false"/>
+                <w:bCs w:val="false"/>
+                <w:i w:val="false"/>
+                <w:iCs w:val="false"/>
+                <w:color w:val="000000"/>
+                <w:sz w:val="14"/>
+                <w:szCs w:val="14"/>
+              </w:rPr>
+              <w:t xml:space="preserve">Verificar normalidad de las diferencias (Shapiro-Wilk) y aplicar prueba t de Student pareada o, en su defecto, Wilcoxon.</w:t>
+            </w:r>
+          </w:p>
+        </w:tc>
+        <w:tc>
+          <w:tcPr>
+            <w:tcW w:type="dxa" w:w="1350"/>
+            <w:shd w:fill="FFFFFF" w:val="clear"/>
+            <w:tcMar>
+              <w:top w:type="dxa" w:w="60"/>
+              <w:left w:type="dxa" w:w="80"/>
+              <w:bottom w:type="dxa" w:w="60"/>
+              <w:right w:type="dxa" w:w="80"/>
+            </w:tcMar>
+            <w:vAlign w:val="center"/>
+          </w:tcPr>
+          <w:p>
+            <w:pPr>
+              <w:spacing w:line="240" w:lineRule="auto"/>
+              <w:jc w:val="left"/>
+            </w:pPr>
+            <w:r>
+              <w:rPr>
+                <w:rFonts w:ascii="Times New Roman" w:cs="Times New Roman" w:eastAsia="Times New Roman" w:hAnsi="Times New Roman"/>
+                <w:b w:val="false"/>
+                <w:bCs w:val="false"/>
+                <w:i w:val="false"/>
+                <w:iCs w:val="false"/>
+                <w:color w:val="000000"/>
+                <w:sz w:val="14"/>
+                <w:szCs w:val="14"/>
+              </w:rPr>
+              <w:t xml:space="preserve">α = 0.05; H0/H1 formales.</w:t>
+            </w:r>
+          </w:p>
+        </w:tc>
+        <w:tc>
+          <w:tcPr>
+            <w:tcW w:type="dxa" w:w="1300"/>
+            <w:shd w:fill="FFFFFF" w:val="clear"/>
+            <w:tcMar>
+              <w:top w:type="dxa" w:w="60"/>
+              <w:left w:type="dxa" w:w="80"/>
+              <w:bottom w:type="dxa" w:w="60"/>
+              <w:right w:type="dxa" w:w="80"/>
+            </w:tcMar>
+            <w:vAlign w:val="center"/>
+          </w:tcPr>
+          <w:p>
+            <w:pPr>
+              <w:spacing w:line="240" w:lineRule="auto"/>
+              <w:jc w:val="left"/>
+            </w:pPr>
+            <w:r>
+              <w:rPr>
+                <w:rFonts w:ascii="Times New Roman" w:cs="Times New Roman" w:eastAsia="Times New Roman" w:hAnsi="Times New Roman"/>
+                <w:b w:val="false"/>
+                <w:bCs w:val="false"/>
+                <w:i w:val="false"/>
+                <w:iCs w:val="false"/>
+                <w:color w:val="000000"/>
+                <w:sz w:val="14"/>
+                <w:szCs w:val="14"/>
+              </w:rPr>
+              <w:t xml:space="preserve">Script + tabla estadística.</w:t>
+            </w:r>
+          </w:p>
+        </w:tc>
+        <w:tc>
+          <w:tcPr>
+            <w:tcW w:type="dxa" w:w="1300"/>
+            <w:shd w:fill="FFFFFF" w:val="clear"/>
+            <w:tcMar>
+              <w:top w:type="dxa" w:w="60"/>
+              <w:left w:type="dxa" w:w="80"/>
+              <w:bottom w:type="dxa" w:w="60"/>
+              <w:right w:type="dxa" w:w="80"/>
+            </w:tcMar>
+            <w:vAlign w:val="center"/>
+          </w:tcPr>
+          <w:p>
+            <w:pPr>
+              <w:spacing w:line="240" w:lineRule="auto"/>
+              <w:jc w:val="left"/>
+            </w:pPr>
+            <w:r>
+              <w:rPr>
+                <w:rFonts w:ascii="Times New Roman" w:cs="Times New Roman" w:eastAsia="Times New Roman" w:hAnsi="Times New Roman"/>
+                <w:b w:val="false"/>
+                <w:bCs w:val="false"/>
+                <w:i w:val="false"/>
+                <w:iCs w:val="false"/>
+                <w:color w:val="000000"/>
+                <w:sz w:val="14"/>
+                <w:szCs w:val="14"/>
+              </w:rPr>
+              <w:t xml:space="preserve">p-value y decisión sobre H0.</w:t>
+            </w:r>
+          </w:p>
+        </w:tc>
+        <w:tc>
+          <w:tcPr>
+            <w:tcW w:type="dxa" w:w="1350"/>
+            <w:shd w:fill="FFFFFF" w:val="clear"/>
+            <w:tcMar>
+              <w:top w:type="dxa" w:w="60"/>
+              <w:left w:type="dxa" w:w="80"/>
+              <w:bottom w:type="dxa" w:w="60"/>
+              <w:right w:type="dxa" w:w="80"/>
+            </w:tcMar>
+            <w:vAlign w:val="center"/>
+          </w:tcPr>
+          <w:p>
+            <w:pPr>
+              <w:spacing w:line="240" w:lineRule="auto"/>
+              <w:jc w:val="left"/>
+            </w:pPr>
+            <w:r>
+              <w:rPr>
+                <w:rFonts w:ascii="Times New Roman" w:cs="Times New Roman" w:eastAsia="Times New Roman" w:hAnsi="Times New Roman"/>
+                <w:b w:val="false"/>
+                <w:bCs w:val="false"/>
+                <w:i w:val="false"/>
+                <w:iCs w:val="false"/>
+                <w:color w:val="000000"/>
+                <w:sz w:val="14"/>
+                <w:szCs w:val="14"/>
+              </w:rPr>
+              <w:t xml:space="preserve">Evidencia cuantitativa del efecto del chatbot en la atención ciudadana (mismo sujeto, antes/después).</w:t>
+            </w:r>
+          </w:p>
+        </w:tc>
+      </w:tr>
+      <w:tr>
+        <w:tc>
+          <w:tcPr>
+            <w:tcW w:type="dxa" w:w="380"/>
+            <w:shd w:fill="F2F2F2" w:val="clear"/>
+            <w:tcMar>
+              <w:top w:type="dxa" w:w="60"/>
+              <w:left w:type="dxa" w:w="80"/>
+              <w:bottom w:type="dxa" w:w="60"/>
+              <w:right w:type="dxa" w:w="80"/>
+            </w:tcMar>
+            <w:vAlign w:val="center"/>
+          </w:tcPr>
+          <w:p>
+            <w:pPr>
+              <w:spacing w:line="240" w:lineRule="auto"/>
+              <w:jc w:val="left"/>
+            </w:pPr>
+            <w:r>
+              <w:rPr>
+                <w:rFonts w:ascii="Times New Roman" w:cs="Times New Roman" w:eastAsia="Times New Roman" w:hAnsi="Times New Roman"/>
+                <w:b/>
+                <w:bCs/>
+                <w:i w:val="false"/>
+                <w:iCs w:val="false"/>
+                <w:color w:val="000000"/>
+                <w:sz w:val="14"/>
+                <w:szCs w:val="14"/>
+              </w:rPr>
+              <w:t xml:space="preserve">T14</w:t>
+            </w:r>
+          </w:p>
+        </w:tc>
+        <w:tc>
+          <w:tcPr>
+            <w:tcW w:type="dxa" w:w="1550"/>
+            <w:shd w:fill="F2F2F2" w:val="clear"/>
+            <w:tcMar>
+              <w:top w:type="dxa" w:w="60"/>
+              <w:left w:type="dxa" w:w="80"/>
+              <w:bottom w:type="dxa" w:w="60"/>
+              <w:right w:type="dxa" w:w="80"/>
+            </w:tcMar>
+            <w:vAlign w:val="center"/>
+          </w:tcPr>
+          <w:p>
+            <w:pPr>
+              <w:spacing w:line="240" w:lineRule="auto"/>
+              <w:jc w:val="left"/>
+            </w:pPr>
+            <w:r>
+              <w:rPr>
+                <w:rFonts w:ascii="Times New Roman" w:cs="Times New Roman" w:eastAsia="Times New Roman" w:hAnsi="Times New Roman"/>
+                <w:b/>
+                <w:bCs/>
+                <w:i w:val="false"/>
+                <w:iCs w:val="false"/>
+                <w:color w:val="000000"/>
+                <w:sz w:val="14"/>
+                <w:szCs w:val="14"/>
+              </w:rPr>
+              <w:t xml:space="preserve">OE1-OE4</w:t>
+            </w:r>
+          </w:p>
+        </w:tc>
+        <w:tc>
+          <w:tcPr>
+            <w:tcW w:type="dxa" w:w="1300"/>
+            <w:shd w:fill="F2F2F2" w:val="clear"/>
+            <w:tcMar>
+              <w:top w:type="dxa" w:w="60"/>
+              <w:left w:type="dxa" w:w="80"/>
+              <w:bottom w:type="dxa" w:w="60"/>
+              <w:right w:type="dxa" w:w="80"/>
+            </w:tcMar>
+            <w:vAlign w:val="center"/>
+          </w:tcPr>
+          <w:p>
+            <w:pPr>
+              <w:spacing w:line="240" w:lineRule="auto"/>
+              <w:jc w:val="left"/>
+            </w:pPr>
+            <w:r>
+              <w:rPr>
+                <w:rFonts w:ascii="Times New Roman" w:cs="Times New Roman" w:eastAsia="Times New Roman" w:hAnsi="Times New Roman"/>
+                <w:b w:val="false"/>
+                <w:bCs w:val="false"/>
+                <w:i w:val="false"/>
+                <w:iCs w:val="false"/>
+                <w:color w:val="000000"/>
+                <w:sz w:val="14"/>
+                <w:szCs w:val="14"/>
+              </w:rPr>
+              <w:t xml:space="preserve">Garantizar reproducibilidad.</w:t>
+            </w:r>
+          </w:p>
+        </w:tc>
+        <w:tc>
+          <w:tcPr>
+            <w:tcW w:type="dxa" w:w="1300"/>
+            <w:shd w:fill="F2F2F2" w:val="clear"/>
+            <w:tcMar>
+              <w:top w:type="dxa" w:w="60"/>
+              <w:left w:type="dxa" w:w="80"/>
+              <w:bottom w:type="dxa" w:w="60"/>
+              <w:right w:type="dxa" w:w="80"/>
+            </w:tcMar>
+            <w:vAlign w:val="center"/>
+          </w:tcPr>
+          <w:p>
+            <w:pPr>
+              <w:spacing w:line="240" w:lineRule="auto"/>
+              <w:jc w:val="left"/>
+            </w:pPr>
+            <w:r>
+              <w:rPr>
+                <w:rFonts w:ascii="Times New Roman" w:cs="Times New Roman" w:eastAsia="Times New Roman" w:hAnsi="Times New Roman"/>
+                <w:b w:val="false"/>
+                <w:bCs w:val="false"/>
+                <w:i w:val="false"/>
+                <w:iCs w:val="false"/>
+                <w:color w:val="000000"/>
+                <w:sz w:val="14"/>
+                <w:szCs w:val="14"/>
+              </w:rPr>
+              <w:t xml:space="preserve">Todos los experimentos.</w:t>
+            </w:r>
+          </w:p>
+        </w:tc>
+        <w:tc>
+          <w:tcPr>
+            <w:tcW w:type="dxa" w:w="1550"/>
+            <w:shd w:fill="F2F2F2" w:val="clear"/>
+            <w:tcMar>
+              <w:top w:type="dxa" w:w="60"/>
+              <w:left w:type="dxa" w:w="80"/>
+              <w:bottom w:type="dxa" w:w="60"/>
+              <w:right w:type="dxa" w:w="80"/>
+            </w:tcMar>
+            <w:vAlign w:val="center"/>
+          </w:tcPr>
+          <w:p>
+            <w:pPr>
+              <w:spacing w:line="240" w:lineRule="auto"/>
+              <w:jc w:val="left"/>
+            </w:pPr>
+            <w:r>
+              <w:rPr>
+                <w:rFonts w:ascii="Times New Roman" w:cs="Times New Roman" w:eastAsia="Times New Roman" w:hAnsi="Times New Roman"/>
+                <w:b w:val="false"/>
+                <w:bCs w:val="false"/>
+                <w:i w:val="false"/>
+                <w:iCs w:val="false"/>
+                <w:color w:val="000000"/>
+                <w:sz w:val="14"/>
+                <w:szCs w:val="14"/>
+              </w:rPr>
+              <w:t xml:space="preserve">Integrar código, configuraciones, seeds, logs y resultados.</w:t>
+            </w:r>
+          </w:p>
+        </w:tc>
+        <w:tc>
+          <w:tcPr>
+            <w:tcW w:type="dxa" w:w="1350"/>
+            <w:shd w:fill="F2F2F2" w:val="clear"/>
+            <w:tcMar>
+              <w:top w:type="dxa" w:w="60"/>
+              <w:left w:type="dxa" w:w="80"/>
+              <w:bottom w:type="dxa" w:w="60"/>
+              <w:right w:type="dxa" w:w="80"/>
+            </w:tcMar>
+            <w:vAlign w:val="center"/>
+          </w:tcPr>
+          <w:p>
+            <w:pPr>
+              <w:spacing w:line="240" w:lineRule="auto"/>
+              <w:jc w:val="left"/>
+            </w:pPr>
+            <w:r>
+              <w:rPr>
+                <w:rFonts w:ascii="Times New Roman" w:cs="Times New Roman" w:eastAsia="Times New Roman" w:hAnsi="Times New Roman"/>
+                <w:b w:val="false"/>
+                <w:bCs w:val="false"/>
+                <w:i w:val="false"/>
+                <w:iCs w:val="false"/>
+                <w:color w:val="000000"/>
+                <w:sz w:val="14"/>
+                <w:szCs w:val="14"/>
+              </w:rPr>
+              <w:t xml:space="preserve">Versionado del protocolo y del software.</w:t>
+            </w:r>
+          </w:p>
+        </w:tc>
+        <w:tc>
+          <w:tcPr>
+            <w:tcW w:type="dxa" w:w="1300"/>
+            <w:shd w:fill="F2F2F2" w:val="clear"/>
+            <w:tcMar>
+              <w:top w:type="dxa" w:w="60"/>
+              <w:left w:type="dxa" w:w="80"/>
+              <w:bottom w:type="dxa" w:w="60"/>
+              <w:right w:type="dxa" w:w="80"/>
+            </w:tcMar>
+            <w:vAlign w:val="center"/>
+          </w:tcPr>
+          <w:p>
+            <w:pPr>
+              <w:spacing w:line="240" w:lineRule="auto"/>
+              <w:jc w:val="left"/>
+            </w:pPr>
+            <w:r>
+              <w:rPr>
+                <w:rFonts w:ascii="Times New Roman" w:cs="Times New Roman" w:eastAsia="Times New Roman" w:hAnsi="Times New Roman"/>
+                <w:b w:val="false"/>
+                <w:bCs w:val="false"/>
+                <w:i w:val="false"/>
+                <w:iCs w:val="false"/>
+                <w:color w:val="000000"/>
+                <w:sz w:val="14"/>
+                <w:szCs w:val="14"/>
+              </w:rPr>
+              <w:t xml:space="preserve">Repositorio + README.md</w:t>
+            </w:r>
+          </w:p>
+        </w:tc>
+        <w:tc>
+          <w:tcPr>
+            <w:tcW w:type="dxa" w:w="1300"/>
+            <w:shd w:fill="F2F2F2" w:val="clear"/>
+            <w:tcMar>
+              <w:top w:type="dxa" w:w="60"/>
+              <w:left w:type="dxa" w:w="80"/>
+              <w:bottom w:type="dxa" w:w="60"/>
+              <w:right w:type="dxa" w:w="80"/>
+            </w:tcMar>
+            <w:vAlign w:val="center"/>
+          </w:tcPr>
+          <w:p>
+            <w:pPr>
+              <w:spacing w:line="240" w:lineRule="auto"/>
+              <w:jc w:val="left"/>
+            </w:pPr>
+            <w:r>
+              <w:rPr>
+                <w:rFonts w:ascii="Times New Roman" w:cs="Times New Roman" w:eastAsia="Times New Roman" w:hAnsi="Times New Roman"/>
+                <w:b w:val="false"/>
+                <w:bCs w:val="false"/>
+                <w:i w:val="false"/>
+                <w:iCs w:val="false"/>
+                <w:color w:val="000000"/>
+                <w:sz w:val="14"/>
+                <w:szCs w:val="14"/>
+              </w:rPr>
+              <w:t xml:space="preserve">Experimento reproducible y rastreable.</w:t>
+            </w:r>
+          </w:p>
+        </w:tc>
+        <w:tc>
+          <w:tcPr>
+            <w:tcW w:type="dxa" w:w="1350"/>
+            <w:shd w:fill="F2F2F2" w:val="clear"/>
+            <w:tcMar>
+              <w:top w:type="dxa" w:w="60"/>
+              <w:left w:type="dxa" w:w="80"/>
+              <w:bottom w:type="dxa" w:w="60"/>
+              <w:right w:type="dxa" w:w="80"/>
+            </w:tcMar>
+            <w:vAlign w:val="center"/>
+          </w:tcPr>
+          <w:p>
+            <w:pPr>
+              <w:spacing w:line="240" w:lineRule="auto"/>
+              <w:jc w:val="left"/>
+            </w:pPr>
+            <w:r>
+              <w:rPr>
+                <w:rFonts w:ascii="Times New Roman" w:cs="Times New Roman" w:eastAsia="Times New Roman" w:hAnsi="Times New Roman"/>
+                <w:b w:val="false"/>
+                <w:bCs w:val="false"/>
+                <w:i w:val="false"/>
+                <w:iCs w:val="false"/>
+                <w:color w:val="000000"/>
+                <w:sz w:val="14"/>
+                <w:szCs w:val="14"/>
+              </w:rPr>
+              <w:t xml:space="preserve">Trazabilidad completa objetivo→resultado.</w:t>
+            </w:r>
+          </w:p>
+        </w:tc>
+      </w:tr>
+      <w:tr>
+        <w:tc>
+          <w:tcPr>
+            <w:tcW w:type="dxa" w:w="380"/>
+            <w:shd w:fill="FFFFFF" w:val="clear"/>
+            <w:tcMar>
+              <w:top w:type="dxa" w:w="60"/>
+              <w:left w:type="dxa" w:w="80"/>
+              <w:bottom w:type="dxa" w:w="60"/>
+              <w:right w:type="dxa" w:w="80"/>
+            </w:tcMar>
+            <w:vAlign w:val="center"/>
+          </w:tcPr>
+          <w:p>
+            <w:pPr>
+              <w:spacing w:line="240" w:lineRule="auto"/>
+              <w:jc w:val="left"/>
+            </w:pPr>
+            <w:r>
+              <w:rPr>
+                <w:rFonts w:ascii="Times New Roman" w:cs="Times New Roman" w:eastAsia="Times New Roman" w:hAnsi="Times New Roman"/>
+                <w:b/>
+                <w:bCs/>
+                <w:i w:val="false"/>
+                <w:iCs w:val="false"/>
+                <w:color w:val="000000"/>
+                <w:sz w:val="14"/>
+                <w:szCs w:val="14"/>
+              </w:rPr>
+              <w:t xml:space="preserve">T15</w:t>
+            </w:r>
+          </w:p>
+        </w:tc>
+        <w:tc>
+          <w:tcPr>
+            <w:tcW w:type="dxa" w:w="1550"/>
+            <w:shd w:fill="FFFFFF" w:val="clear"/>
+            <w:tcMar>
+              <w:top w:type="dxa" w:w="60"/>
+              <w:left w:type="dxa" w:w="80"/>
+              <w:bottom w:type="dxa" w:w="60"/>
+              <w:right w:type="dxa" w:w="80"/>
+            </w:tcMar>
+            <w:vAlign w:val="center"/>
+          </w:tcPr>
+          <w:p>
+            <w:pPr>
+              <w:spacing w:line="240" w:lineRule="auto"/>
+              <w:jc w:val="left"/>
+            </w:pPr>
+            <w:r>
+              <w:rPr>
+                <w:rFonts w:ascii="Times New Roman" w:cs="Times New Roman" w:eastAsia="Times New Roman" w:hAnsi="Times New Roman"/>
+                <w:b/>
+                <w:bCs/>
+                <w:i w:val="false"/>
+                <w:iCs w:val="false"/>
+                <w:color w:val="000000"/>
+                <w:sz w:val="14"/>
+                <w:szCs w:val="14"/>
+              </w:rPr>
+              <w:t xml:space="preserve">OE1-OE4</w:t>
+            </w:r>
+          </w:p>
+        </w:tc>
+        <w:tc>
+          <w:tcPr>
+            <w:tcW w:type="dxa" w:w="1300"/>
+            <w:shd w:fill="FFFFFF" w:val="clear"/>
+            <w:tcMar>
+              <w:top w:type="dxa" w:w="60"/>
+              <w:left w:type="dxa" w:w="80"/>
+              <w:bottom w:type="dxa" w:w="60"/>
+              <w:right w:type="dxa" w:w="80"/>
+            </w:tcMar>
+            <w:vAlign w:val="center"/>
+          </w:tcPr>
+          <w:p>
+            <w:pPr>
+              <w:spacing w:line="240" w:lineRule="auto"/>
+              <w:jc w:val="left"/>
+            </w:pPr>
+            <w:r>
+              <w:rPr>
+                <w:rFonts w:ascii="Times New Roman" w:cs="Times New Roman" w:eastAsia="Times New Roman" w:hAnsi="Times New Roman"/>
+                <w:b w:val="false"/>
+                <w:bCs w:val="false"/>
+                <w:i w:val="false"/>
+                <w:iCs w:val="false"/>
+                <w:color w:val="000000"/>
+                <w:sz w:val="14"/>
+                <w:szCs w:val="14"/>
+              </w:rPr>
               <w:t xml:space="preserve">Registrar incidencias y desviaciones del protocolo.</w:t>
             </w:r>
           </w:p>
@@ -7556,7 +8576,7 @@
                 <w:sz w:val="14"/>
                 <w:szCs w:val="14"/>
               </w:rPr>
-              <w:t xml:space="preserve">Cualquier desviación durante P01–P14 (falla de despliegue, reetiquetado, corte de energía, etc.).</w:t>
+              <w:t xml:space="preserve">Cualquier desviación durante P01–P14 (falla de despliegue, reetiquetado, corte de energía, ajuste de ítems tras T07.2, etc.).</w:t>
             </w:r>
           </w:p>
         </w:tc>

</xml_diff>